<commit_message>
docs: sync technical guide with v1.7.4 humidity behavior
</commit_message>
<xml_diff>
--- a/docs/vtsimnx_calculation_model_and_implementation_flow_ja_v3.2.docx
+++ b/docs/vtsimnx_calculation_model_and_implementation_flow_ja_v3.2.docx
@@ -171,7 +171,7 @@
               <w:spacing w:after="0" w:line="240" w:lineRule="auto"/>
             </w:pPr>
             <w:r>
-              <w:t>vtsimnx v1.7.2</w:t>
+              <w:t>vtsimnx v1.7.4</w:t>
             </w:r>
           </w:p>
         </w:tc>
@@ -219,7 +219,7 @@
               <w:spacing w:after="0" w:line="240" w:lineRule="auto"/>
             </w:pPr>
             <w:r>
-              <w:t>Git commit db107ac</w:t>
+              <w:t>Git commit 9a5c379</w:t>
             </w:r>
           </w:p>
         </w:tc>
@@ -259,7 +259,7 @@
           </w:tcPr>
           <w:p>
             <w:r>
-              <w:t>2026年9月6日（文書v3.2改訂）</w:t>
+              <w:t>2026年9月6日（v1.7.4実装へ同期）</w:t>
             </w:r>
           </w:p>
         </w:tc>
@@ -2182,7 +2182,7 @@
         </w:rPr>
       </w:pPr>
       <w:r>
-        <w:t>本書は文書版v3.2の改訂版であり、パッケージv1.7.2、Git commit db107ac276d9c0a9949bbe4358d06cb8b0595fadの実装を対象とする。換気、RC熱回路網、応答係数法、線形湿気回路網、濃度、空調制御および電力推定を説明する。応答係数法の式・係数生成・履歴処理・適用限界は6.7節を参照する。</w:t>
+        <w:t>本書は文書版v3.2の改訂版であり、パッケージv1.7.4、Git commit 9a5c379b7d7226e724cd65cce736147ba95b9792の実装を対象とする。換気、RC熱回路網、応答係数法、線形湿気回路網、濃度、空調制御および電力推定を説明する。応答係数法は6.7節、v1.7.4の空調湿度境界と理想除湿は7.3節・9.5節を参照する。</w:t>
       </w:r>
     </w:p>
     <w:p>
@@ -14805,7 +14805,7 @@
         </w:rPr>
       </w:pPr>
       <w:r>
-        <w:t>変換順序には意味がある。たとえば surface を展開して壁体 node を作らなければ、放射発熱の配分先や熱容量 branch を定義できない。また aircon を展開する前に、制御対象 node の湿気・濃度計算フラグを機器内部の aircon node へ引き継ぐ必要がある。実装の主要な順序は次のとおりである。</w:t>
+        <w:t>変換順序には意味がある。surfaceを展開して壁体nodeを作った後に、放射発熱や熱容量のbranchを生成する。空調展開では、設定対象nodeの濃度計算フラグを引き継ぐ一方、湿度は吹出状態を固定境界として与えるため計算フラグを引き継がない。実装の主要な順序は次のとおりである。</w:t>
       </w:r>
     </w:p>
     <w:p>
@@ -14850,7 +14850,7 @@
         </w:rPr>
       </w:pPr>
       <w:r>
-        <w:t>4.　付加湿気容量を持つ節点のcalc_xを立て、set_nodeのcalc_x/calc_cをaircon設定へ引き継ぐ。その後、空調節点、吸込・吹出枝、制御条件を生成する。</w:t>
+        <w:t>4.　付加湿気容量を持つ節点のcalc_xを立てる。set_nodeのcalc_cをaircon設定へ引き継ぐが、空調節点のcalc_xはfalseとする。その後、空調節点、吸込・吹出枝、設定温度・設定相対湿度等の制御条件を生成する。</w:t>
       </w:r>
     </w:p>
     <w:p>
@@ -26002,6 +26002,28 @@
     </w:p>
     <w:p>
       <w:pPr>
+        <w:ind w:firstLineChars="100" w:firstLine="230"/>
+        <w:rPr>
+          <w:lang w:eastAsia="ja-JP"/>
+        </w:rPr>
+      </w:pPr>
+      <w:r>
+        <w:t>空調nodeは吹出絶対湿度を与える固定境界であり、calc_x=falseとして未知数から除外する。固定境界の値自体は外側空調反復で更新する。非連成経路で前時刻のxへ戻す場合も湿気未知nodeだけを復元し、外気・空調吹出の更新値を保持する。</w:t>
+      </w:r>
+    </w:p>
+    <w:p>
+      <w:pPr>
+        <w:ind w:firstLineChars="100" w:firstLine="230"/>
+        <w:rPr>
+          <w:lang w:eastAsia="ja-JP"/>
+        </w:rPr>
+      </w:pPr>
+      <w:r>
+        <w:t>停止中またはcurrent_modeがCOOLING以外の空調nodeに直接接続する換気枝は、吸込・吹出の両側とも湿気移流から除外する。換気・熱計算の風量は維持する。同室循環の相殺を想定する近似であり、異室間の水分移動は省略される。AUTOも文字列比較により除外されるため、冷房相当運転の熱量と湿気輸送の整合には注意が必要である。同じ上流・下流間の複数枝の流量は合算する。</w:t>
+      </w:r>
+    </w:p>
+    <w:p>
+      <w:pPr>
         <w:keepNext/>
         <w:keepLines/>
         <w:spacing w:before="80" w:after="60"/>
@@ -28363,7 +28385,7 @@
         </w:rPr>
       </w:pPr>
       <w:r>
-        <w:t>1.　時間ステップ開始時に、要求設定温度と運転モードをスケジュールから取得する。実効設定温度を要求値で初期化し、能力制限探索の探索区間（bracket）を設定する。</w:t>
+        <w:t>1.　時間ステップ開始時に、要求設定温度、設定相対湿度pre_rh（指定時）と運転モードをスケジュールから取得する。実効設定温度を要求値で初期化し、能力制限探索の探索区間（bracket）を設定する。</w:t>
       </w:r>
     </w:p>
     <w:p>
@@ -28378,7 +28400,7 @@
         <w:rPr>
           <w:lang w:eastAsia="ja-JP"/>
         </w:rPr>
-        <w:t>2.　現在の空調状態を固定し、内側連成で圧力、風量、温度、絶対湿度を解く。ここで得る状態は、まだ仮の空調条件に対する解である。</w:t>
+        <w:t>2.　物理求解前に、停止中・非冷房または未初期化の空調吹出湿度を吸込湿度へ同期する。現在の空調状態を固定し、内側連成で圧力、風量、温度、絶対湿度を解く。ここで得る状態は、まだ仮の空調条件に対する解である。</w:t>
       </w:r>
     </w:p>
     <w:p>
@@ -28423,7 +28445,7 @@
         <w:rPr>
           <w:lang w:eastAsia="ja-JP"/>
         </w:rPr>
-        <w:t>5.　風量が安定した後、全熱処理量と能力上限を比較し、吹出絶対湿度も aircon node へ適用する。実効設定温度または吹出湿度が変われば再計算する。</w:t>
+        <w:t>5.　風量が安定した後、全熱処理量と能力上限を比較し、吹出絶対湿度も空調nodeへ適用する。実効設定温度の変更や、吹出湿度変化の閾値超過等があれば再計算する。</w:t>
       </w:r>
     </w:p>
     <w:p>
@@ -29853,6 +29875,17 @@
     </w:p>
     <w:p>
       <w:pPr>
+        <w:ind w:firstLineChars="100" w:firstLine="230"/>
+        <w:rPr>
+          <w:lang w:eastAsia="ja-JP"/>
+        </w:rPr>
+      </w:pPr>
+      <w:r>
+        <w:t>OFF中または必要負荷が未評価の場合の温度バンドは、要求設定温度からの片側幅をmax(空調温度許容値, 0.5 K)とする。最小の帯全体は設定値±0.5 Kであり、帯内は運転状態を維持する。運転中の符号付き必要負荷による判定や、能力制限中の判定経路とは区別する。</w:t>
+      </w:r>
+    </w:p>
+    <w:p>
+      <w:pPr>
         <w:pStyle w:val="21"/>
         <w:pageBreakBefore w:val="0"/>
         <w:rPr>
@@ -33609,7 +33642,79 @@
         </w:rPr>
       </w:pPr>
       <w:r>
-        <w:t>算定した supplyX は aircon node の current_x に代入する。前反復値との差が湿度許容値を超える場合、SupplyHumidityChanged を設定して外側反復を継続する。これにより、低絶対湿度の給気による室内 x の低下を同一時間ステップ内に反映する。停止時には supplyX を in_node の x に復帰させ、前時刻の給気状態を残留させない。凝縮水量は診断値として更新するが、その変化のみでは方程式の境界条件が変化しないため、再計算要求には含めない。</w:t>
+        <w:t>算定したsupplyXは空調nodeのcurrent_xへ常に代入する。前回適用値との差がmax(連成湿度許容値, 1e-4 kg/kg(DA))を超える場合、SupplyHumidityChangedを設定する。閾値以下では値は更新するが、その変更だけで再計算を要求しない。凝縮水量は診断値であり、その変化のみでは再計算を要求しない。</w:t>
+      </w:r>
+    </w:p>
+    <w:p>
+      <w:pPr>
+        <w:ind w:firstLineChars="100" w:firstLine="230"/>
+        <w:rPr>
+          <w:lang w:eastAsia="ja-JP"/>
+        </w:rPr>
+      </w:pPr>
+      <w:r>
+        <w:t>各外側反復の物理求解前には、停止中・非冷房、またはcurrent_xが非有限値もしくは1e-4 kg/kg(DA)以下の空調を吸込湿度へ同期する。これは初期・残留境界の整備であり、この同期だけでは再計算要求を立てない。</w:t>
+      </w:r>
+    </w:p>
+    <w:p>
+      <w:pPr>
+        <w:pStyle w:val="31"/>
+        <w:keepNext/>
+        <w:ind w:firstLineChars="100" w:firstLine="0"/>
+        <w:rPr>
+          <w:lang w:eastAsia="ja-JP"/>
+        </w:rPr>
+      </w:pPr>
+      <w:r>
+        <w:t>9.5.5　理想相対湿度目標による吹出湿度の指定</w:t>
+      </w:r>
+    </w:p>
+    <w:p>
+      <w:pPr>
+        <w:keepNext w:val="0"/>
+        <w:ind w:firstLineChars="100" w:firstLine="230"/>
+        <w:rPr>
+          <w:lang w:eastAsia="ja-JP"/>
+        </w:rPr>
+      </w:pPr>
+      <w:r>
+        <w:t>pre_rhに設定相対湿度[%]を与える。値域は0より大きく100以下で、定数または時系列を受理する。冷房運転中で正の処理風量を持ち、吸込絶対湿度が目標を超える場合、従来のlatent_methodに優先して目標を吹出絶対湿度に用いる。</w:t>
+      </w:r>
+    </w:p>
+    <w:p>
+      <w:pPr>
+        <w:keepNext w:val="0"/>
+        <w:ind w:firstLineChars="100" w:firstLine="230"/>
+        <w:rPr>
+          <w:lang w:eastAsia="ja-JP"/>
+        </w:rPr>
+      </w:pPr>
+      <w:r>
+        <w:t>目標はx_sp = absolute_humidity(T_in, pre_rh)、吹出はx_supply = x_sp（x_in &gt; x_spの場合）である。T_inとx_inはin_nodeの状態を参照する。遠隔set_nodeやpre_tempを基準にせず、室の相対湿度を直接拘束するものではない。凝縮水量はρ0 |V̇| (x_in − x_sp) [kg/s]で算定する。</w:t>
+      </w:r>
+    </w:p>
+    <w:p>
+      <w:pPr>
+        <w:keepNext w:val="0"/>
+        <w:ind w:firstLineChars="100" w:firstLine="230"/>
+        <w:rPr>
+          <w:lang w:eastAsia="ja-JP"/>
+        </w:rPr>
+      </w:pPr>
+      <w:r>
+        <w:t>温度制御でOFFのときは湿度超過だけで機器を起動しない。目標超過時はlatent_method=noneよりも優先するが、目標以下では従来のlatent_methodへ戻り、追加除湿する場合がある。従ってpre_rhは室RHの厳密な目標達成や除湿停止の下限を保証しない。</w:t>
+      </w:r>
+    </w:p>
+    <w:p>
+      <w:pPr>
+        <w:keepNext w:val="0"/>
+        <w:ind w:firstLineChars="100" w:firstLine="230"/>
+        <w:rPr>
+          <w:lang w:eastAsia="ja-JP"/>
+        </w:rPr>
+      </w:pPr>
+      <w:r>
+        <w:t>この湿度決定式はコイル能力・機種特性に依存しないが、後段の全熱能力判定は残る。最大能力を超えれば実効設定温度の探索と再計算を行い、条件によっては収束できない。また吹出温度での飽和湿度へ制限する処理がないため、過飽和となる可能性がある。実機コイルの再現性と区別して用いる。</w:t>
       </w:r>
     </w:p>
     <w:p>
@@ -37939,6 +38044,17 @@
     </w:p>
     <w:p>
       <w:pPr>
+        <w:ind w:firstLineChars="100" w:firstLine="230"/>
+        <w:rPr>
+          <w:lang w:eastAsia="ja-JP"/>
+        </w:rPr>
+      </w:pPr>
+      <w:r>
+        <w:t>潜熱フィードバックの緩和係数simulation.coupling.latent_relaxationの既定値は0.5であり、0より大きく1以下を指定する。湿度反復の緩和係数humidity_relaxationの既定値は1.0である。吹出湿度の外側再計算閾値と線形湿気ソルバの残差許容値は別の設定であり、収束したことだけで任意の湿度精度を保証しない。</w:t>
+      </w:r>
+    </w:p>
+    <w:p>
+      <w:pPr>
         <w:pStyle w:val="21"/>
         <w:pageBreakBefore w:val="0"/>
         <w:rPr>
@@ -37967,11 +38083,9 @@
         </w:rPr>
       </w:pPr>
       <w:r>
-        <w:t>内側物理連成が収束した後、全空調機の状態更新要求を集約する。再計算要求の優先順位は ON/OFF、Flow、Capacity、SupplyHumidity である。いずれかの状態量が変化した場合、更新後</w:t>
-      </w:r>
-      <w:r>
-        <w:t>の空調状態を境界条件として内側連成計算を再実行する。全空調機の状態が収束した時点で、その時間ステップを受理する。外側反復回数の平均値・最大値、反復回数が 3 回以上となる時刻の割合および能力制限に起因する再計算割合を simulation_metrics に記録し、収束挙動と制御モデルの影響を評価できる。</w:t>
-      </w:r>
+        <w:t>内側物理連成が収束した後、全空調機の状態更新要求を集約する。再計算要求の優先順位はON/OFF、Flow、Capacity、SupplyHumidityである。それぞれの判定条件に従って再計算を要求し、更新後の空調境界を用いて同一時刻の物理場を再求解する。全台の要求がなく熱の受理条件も満たせば時間ステップを受理する。反復回数や能力制限による再計算割合はsimulation_metricsへ記録する。</w:t>
+      </w:r>
+      <w:r/>
     </w:p>
     <w:p>
       <w:pPr>
@@ -40081,7 +40195,7 @@
         <w:ind w:firstLineChars="100" w:firstLine="230"/>
       </w:pPr>
       <w:r>
-        <w:t>artifact は schema.json と系列別 float32 binary で構成される。schema が node/branch key の順序を保持するため、binary 単独ではなく schema と組にして解釈する。solver.log と simulation_metrics には、収束・再計算・能力制限・切替処理等の診断情報が記録される。</w:t>
+        <w:t>artifactはschema.jsonと系列別float32 binaryで構成される。schemaのseries.&lt;name&gt;.keysが列順を保持する。keys=[]は列数0を意味し、対応するbinは0バイトである。クライアントは(時刻数, 0)のDataFrameへ復元し、1列スカラーとは解釈しない。solver.logとsimulation_metricsには収束・再計算等の診断情報が記録される。</w:t>
       </w:r>
     </w:p>
     <w:p>
@@ -42831,6 +42945,15 @@
     </w:p>
     <w:p>
       <w:pPr>
+        <w:spacing w:after="80"/>
+        <w:ind w:left="216" w:hanging="216"/>
+      </w:pPr>
+      <w:r>
+        <w:t>[R22] docs/aircon_humidity_control.md, docs/documentation_review_2026-09_v174.md — v1.7.4の空調湿度境界、理想除湿、入力例、適用制約と点検記録。</w:t>
+      </w:r>
+    </w:p>
+    <w:p>
+      <w:pPr>
         <w:pStyle w:val="1"/>
         <w:rPr>
           <w:sz w:val="28"/>
@@ -42869,7 +42992,7 @@
         <w:rPr>
           <w:lang w:eastAsia="ja-JP"/>
         </w:rPr>
-        <w:t>圧力は非線形最小二乗、熱・湿気は疎行列直接解法、濃度は旧時刻の上流濃度を固定した局所解析積分を用いる。各式の解法と近似を区別し、時間ステップ・内側連成・外側空調反復で結合する。本改訂の指摘と実装上の未解決事項はdocs/documentation_review_2026-09.mdに記録した。</w:t>
+        <w:t>圧力は非線形最小二乗、熱・湿気は疎行列直接解法、濃度は旧時刻の上流濃度を固定した局所解析積分を用いる。各式の解法と近似を区別し、時間ステップ・内側連成・外側空調反復で結合する。v1.7.4の湿度境界と理想除湿を反映した本改訂の点検結果はdocs/documentation_review_2026-09_v174.mdに記録した。</w:t>
       </w:r>
     </w:p>
     <w:sectPr>
@@ -42976,7 +43099,7 @@
       <w:rPr>
         <w:color w:val="5A636C"/>
       </w:rPr>
-      <w:t xml:space="preserve">vtsimnx v1.7.2 / db107ac　　</w:t>
+      <w:t xml:space="preserve">vtsimnx v1.7.4 / 9a5c379　　</w:t>
     </w:r>
     <w:r>
       <w:rPr>

</xml_diff>

<commit_message>
docs: sync technical guide with v1.7.5
</commit_message>
<xml_diff>
--- a/docs/vtsimnx_calculation_model_and_implementation_flow_ja_v3.2.docx
+++ b/docs/vtsimnx_calculation_model_and_implementation_flow_ja_v3.2.docx
@@ -167,11 +167,8 @@
             <w:vAlign w:val="center"/>
           </w:tcPr>
           <w:p>
-            <w:pPr>
-              <w:spacing w:after="0" w:line="240" w:lineRule="auto"/>
-            </w:pPr>
-            <w:r>
-              <w:t>vtsimnx v1.7.4</w:t>
+            <w:r>
+              <w:t>vtsimnx v1.7.5</w:t>
             </w:r>
           </w:p>
         </w:tc>
@@ -215,11 +212,8 @@
             <w:vAlign w:val="center"/>
           </w:tcPr>
           <w:p>
-            <w:pPr>
-              <w:spacing w:after="0" w:line="240" w:lineRule="auto"/>
-            </w:pPr>
-            <w:r>
-              <w:t>Git commit 9a5c379</w:t>
+            <w:r>
+              <w:t>Git commit 83a724d</w:t>
             </w:r>
           </w:p>
         </w:tc>
@@ -259,7 +253,7 @@
           </w:tcPr>
           <w:p>
             <w:r>
-              <w:t>2026年9月6日（v1.7.4実装へ同期）</w:t>
+              <w:t>2026年9月9日（v1.7.5実装へ同期）</w:t>
             </w:r>
           </w:p>
         </w:tc>
@@ -354,7 +348,7 @@
         <w:rPr>
           <w:lang w:eastAsia="ja-JP"/>
         </w:rPr>
-        <w:t>vtsimnx は、住宅内の複数室、空調機、外気、壁体等を node と branch で表す時刻歴シミュレーション基盤である。圧力計算で得た体積流量を、熱・湿気・濃度の移流に共通利用し、熱・湿気計算から得る室内状態と空調処理熱量を空調制御および電力モデルへ渡す。空調の ON/OFF、風量、能力制限、吹出絶対湿度が変化した場合は、同一時間ステップを再計算する。この外側反復により、単独の負荷計算や単独の換気計算では表しにくい相互作用を単一の連成計算系に保持する。</w:t>
+        <w:t>vtsimnx は、住宅内の複数室、空調機、外気、壁体等を node と branch で表す時刻歴シミュレーション基盤である。圧力計算で得た体積流量を、熱・湿気・濃度の移流に共通利用し、熱・湿気計算から得る室内状態と空調処理熱量を空調制御および電力モデルへ渡す。空調の ON/OFF、能力制限、風量または吹出絶対湿度が変化した場合は、同一時間ステップを再計算する。この外側反復により、単独の負荷計算や単独の換気計算では表しにくい相互作用を単一の連成計算系に保持する。</w:t>
       </w:r>
     </w:p>
     <w:p>
@@ -2125,7 +2119,7 @@
         </w:rPr>
       </w:pPr>
       <w:r>
-        <w:t>3.　室内温湿度と空調設定から、運転・停止、風量、吹出温度、吹出絶対湿度および能力制限を評価する。空調状態が変われば、同一時間ステップの圧力・温度・絶対湿度を再計算する。</w:t>
+        <w:t>3.　室内温湿度と空調設定から、運転・停止、能力制限、送風量および吹出絶対湿度を順に評価する。空調状態が変われば、同一時間ステップの圧力・温度・絶対湿度を再計算する。</w:t>
       </w:r>
     </w:p>
     <w:p>
@@ -2182,7 +2176,7 @@
         </w:rPr>
       </w:pPr>
       <w:r>
-        <w:t>本書は文書版v3.2の改訂版であり、パッケージv1.7.4、Git commit 9a5c379b7d7226e724cd65cce736147ba95b9792の実装を対象とする。換気、RC熱回路網、応答係数法、線形湿気回路網、濃度、空調制御および電力推定を説明する。応答係数法は6.7節、v1.7.4の空調湿度境界と理想除湿は7.3節・9.5節を参照する。</w:t>
+        <w:t>本書は文書版v3.2の改訂版であり、パッケージv1.7.5、Git commit 83a724d376010a85da10163de4797636d795ea90の実装を対象とする。換気、RC熱回路網、応答係数法、線形湿気回路網、濃度、空調制御および電力推定を説明する。応答係数法は6.7節、空調湿度境界と理想除湿は7.3節・9.5節、v1.7.5の全館空調風量・最低能力制御は9.2節・9.3節・9.6節を参照する。</w:t>
       </w:r>
     </w:p>
     <w:p>
@@ -27583,7 +27577,7 @@
         <w:ind w:firstLineChars="100" w:firstLine="230"/>
       </w:pPr>
       <w:r>
-        <w:t>builder は単一の aircon 入力から、in_node → aircon node → out_node を結ぶ 2 本の換気 branch を生成する。in または out が省略された場合には set_node を用いる。このため、室内機と設定対象室が同一であるルームエアコンと、吸込位置、吹出位置および設定対象室が異なる全館空調を同一の入力形式で記述できる。aircon node の温度と絶対湿度は、空調機通過後の給気状態を表す。</w:t>
+        <w:t>builder は単一の aircon 入力から、in_node → aircon node → out_node を結ぶ 2 本の換気 branch を生成する。in または out が省略された場合には set_node を用いる。ファンPQの4点が揃わない場合は両枝を同じ循環向きの固定流量とし、4点が揃う場合は吸込側をfan、吹出側をpressure_lossとして空調機nodeの圧力を未知数にする。aircon node の温度と絶対湿度は、空調機通過後の給気状態を表す。</w:t>
       </w:r>
     </w:p>
     <w:tbl>
@@ -28415,7 +28409,7 @@
         <w:rPr>
           <w:lang w:eastAsia="ja-JP"/>
         </w:rPr>
-        <w:t>3.　全空調機の ON/OFF を判定する。1台でも状態が変われば、風量補正や能力判定へ進まず、直ちに内側連成へ戻る。</w:t>
+        <w:t>3.　全空調機のON/OFFと最低能力を判定する。1台でも状態が変われば、能力判定や風量補正へ進まず、直ちに内側連成へ戻る。</w:t>
       </w:r>
     </w:p>
     <w:p>
@@ -28430,7 +28424,7 @@
         <w:rPr>
           <w:lang w:eastAsia="ja-JP"/>
         </w:rPr>
-        <w:t>4.　ON/OFF が安定した後、DUCT_CENTRAL の処理熱量連動風量を確認する。風量が変われば換気・熱・湿気が変わるため再計算する。</w:t>
+        <w:t>4.　ON/OFFが安定した後、顕熱と潜熱の和を能力上限と比較する。上限を超える場合は実効設定温度を調整し、風量補正へ進まず再計算する。</w:t>
       </w:r>
     </w:p>
     <w:p>
@@ -28445,7 +28439,7 @@
         <w:rPr>
           <w:lang w:eastAsia="ja-JP"/>
         </w:rPr>
-        <w:t>5.　風量が安定した後、全熱処理量と能力上限を比較し、吹出絶対湿度も空調nodeへ適用する。実効設定温度の変更や、吹出湿度変化の閾値超過等があれば再計算する。</w:t>
+        <w:t>5.　能力判定が安定した後、DUCT_CENTRALの負荷追従風量を確認する。固定流量またはファンPQの速度比が変われば、換気・熱・湿気が変わるため再計算する。吹出絶対湿度も適用し、変化が閾値を超えれば再計算する。</w:t>
       </w:r>
     </w:p>
     <w:p>
@@ -29237,11 +29231,9 @@
         </w:rPr>
       </w:pPr>
       <w:r>
-        <w:t>再計算要求は全空調機について論理和で集約する。判定順序は運転・停止、ダクト風量、能力制限、吹出絶対湿度である。この順序により、停止機器に対する不要な能力探索と、前反復の風</w:t>
-      </w:r>
-      <w:r>
-        <w:t>量に基づく能力判定を防止する。最大外側反復回数以内に収束解を受理できない場合、未収束結果を出力せずに計算を停止する。</w:t>
-      </w:r>
+        <w:t>再計算要求は全空調機について論理和で集約する。判定順序は運転・停止、能力制限、DUCT_CENTRAL風量、吹出絶対湿度であり、前段が変化した周には後段を更新しない。この順序により、停止機器に対する不要な能力探索と、能力探索中または旧風量の処理熱に基づく風量更新を防止する。最大外側反復回数以内に収束解を受理できない場合、未収束結果を出力せずに計算を停止する。</w:t>
+      </w:r>
+      <w:r/>
     </w:p>
     <w:p>
       <w:pPr>
@@ -29881,7 +29873,29 @@
         </w:rPr>
       </w:pPr>
       <w:r>
-        <w:t>OFF中または必要負荷が未評価の場合の温度バンドは、要求設定温度からの片側幅をmax(空調温度許容値, 0.5 K)とする。最小の帯全体は設定値±0.5 Kであり、帯内は運転状態を維持する。運転中の符号付き必要負荷による判定や、能力制限中の判定経路とは区別する。</w:t>
+        <w:t>停止後の再起動および最低能力判定に用いる温度バンドの片側幅は、要求設定温度に対してmax(空調温度許容値, 1.0 K)とする。暖房では要求より十分低い場合、冷房では十分高い場合に再起動する。DUCT_CENTRALで要求未達時に能力上限を風量基準とする0.5 Kの判定とは目的が異なる。</w:t>
+      </w:r>
+    </w:p>
+    <w:p>
+      <w:pPr>
+        <w:ind w:firstLineChars="100" w:firstLine="230"/>
+        <w:rPr>
+          <w:lang w:eastAsia="ja-JP"/>
+        </w:rPr>
+      </w:pPr>
+      <w:r>
+        <w:t>設定維持に必要な負荷がQ.min未満なら、機種を問わず停止して室温を自由にする。ただし停止側の自由室温が既に再起動幅の外に出る場合は、ON/OFFの往復を避けるためONを維持し、Q.minを処理する。ちょうどQ.minは運転可能であり、Q.minを持たない機種にはこの最低能力停止を適用しない。</w:t>
+      </w:r>
+    </w:p>
+    <w:p>
+      <w:pPr>
+        <w:ind w:firstLineChars="100" w:firstLine="230"/>
+        <w:rPr>
+          <w:lang w:eastAsia="ja-JP"/>
+        </w:rPr>
+      </w:pPr>
+      <w:r>
+        <w:t>必要負荷を用いるのは、運転中、制御nodeが実効設定近傍、能力制限中でない、要求設定から実効設定が外れていない、かつ処理風量が1×10⁻⁴ m³/sより大きい場合である。これらを満たさない場合は温度バンドによる判定へ戻す。</w:t>
       </w:r>
     </w:p>
     <w:p>
@@ -33741,17 +33755,29 @@
     </w:p>
     <w:p>
       <w:pPr>
+        <w:pStyle w:val="31"/>
+        <w:keepNext/>
+        <w:pageBreakBefore w:val="0"/>
+        <w:rPr>
+          <w:sz w:val="28"/>
+          <w:lang w:eastAsia="ja-JP"/>
+        </w:rPr>
+      </w:pPr>
+      <w:r>
+        <w:t>9.6.1　能力上限と実効設定温度</w:t>
+      </w:r>
+    </w:p>
+    <w:p>
+      <w:pPr>
         <w:ind w:firstLineChars="100" w:firstLine="230"/>
       </w:pPr>
       <w:r>
         <w:rPr>
           <w:lang w:eastAsia="ja-JP"/>
         </w:rPr>
-        <w:t>処理全熱が Q.max、または max がない機種では Q.mid を超えると、実効設定温度 current_pre_temp を能力以下となる方向へ調整する。暖房では下げ、冷房では上げる。まず入口条件・流量を固定した近似式を使い、必要に応じ bracket 二分探索へ移る。設定温度が変われば熱回路網を再計算し、最終検証でも能力上限を満たせず探索を拡張できない場合は例外として終了する。</w:t>
-      </w:r>
-      <w:r>
-        <w:t>要求設定 current_requested_pre_temp と、能力制限後の実効設定 current_pre_temp は区別される。</w:t>
-      </w:r>
+        <w:t>処理全熱が能力上限を超えると、実効設定温度 current_pre_temp を能力以下となる方向へ調整する。上限は対象モードの Q.max、無ければ Q.rtd、さらに無ければ Q.mid の順に解決する。暖房では実効設定温度を下げ、冷房では上げる。まず入口条件・流量を固定した近似式を使い、必要に応じ bracket 二分探索へ移る。要求設定 current_requested_pre_temp と、能力制限後の実効設定 current_pre_temp は区別される。</w:t>
+      </w:r>
+      <w:r/>
     </w:p>
     <w:tbl>
       <w:tblPr>
@@ -34084,6 +34110,19 @@
         <w:t>能力判定は全熱と上限を比較し、実効設定温度を探索する。探索区間幅が1×10⁻³℃以下なら非超過側を採用して再計算する。許容差は上限の0.1%に1 Wを加えた値であり、最終受理では上限を超えない不足側の解も許容する。要求設定を満たせない場合の実効設定温度は、要求値と分けて報告する。</w:t>
       </w:r>
       <w:r/>
+    </w:p>
+    <w:p>
+      <w:pPr>
+        <w:pStyle w:val="31"/>
+        <w:keepNext/>
+        <w:ind w:firstLineChars="100" w:firstLine="230"/>
+        <w:rPr>
+          <w:lang w:eastAsia="ja-JP"/>
+        </w:rPr>
+      </w:pPr>
+      <w:r>
+        <w:t>9.6.2　負荷追従風量の基準</w:t>
+      </w:r>
     </w:p>
     <w:p>
       <w:pPr>
@@ -34349,7 +34388,7 @@
           <w:i/>
           <w:color w:val="5A636C"/>
         </w:rPr>
-        <w:t>DUCT_CENTRAL の処理熱量連動風量。ratio は0から1の範囲に制限する。</w:t>
+        <w:t>DUCT_CENTRAL の負荷追従風量。式のQbasisは状態に応じた基準熱量[W]、Qrtdは対象モードの定格能力[kW]を1000倍した値、VdsgnはV_inner.dsgn[m³/s]である。ratioは0から1の範囲に制限する。</w:t>
       </w:r>
     </w:p>
     <w:p>
@@ -34360,7 +34399,67 @@
         </w:rPr>
       </w:pPr>
       <w:r>
-        <w:t>DUCT_CENTRALでは正のQ.rtd[kW]とV_inner.dsgn[m³/s]が得られる場合に風量を補正する。式中のQとQratedは同じW単位へそろえる。定格以上は設計風量に制限され、仕様値がない場合はこの補正を行わない。</w:t>
+        <w:t>設定維持中は制御nodeの必要負荷|required_heat_w|を基準とする。能力制限中または要求未達（暖房は要求より0.5 K以上低い、冷房は0.5 K以上高い）では能力上限を用い、set_nodeが無い場合だけ吸込・吹出の計測全熱を用いる。Q.rtdまたはV_inner.dsgnが得られないモードでは、この風量補正を行わない。</w:t>
+      </w:r>
+    </w:p>
+    <w:p>
+      <w:pPr>
+        <w:ind w:firstLineChars="100" w:firstLine="230"/>
+        <w:rPr>
+          <w:lang w:eastAsia="ja-JP"/>
+        </w:rPr>
+      </w:pPr>
+      <w:r>
+        <w:t>基準熱量が0なら目標風量は0とする。正でQ.min未満の場合は、線形に0へ近づけずVdsgn×Q.min/Q.rtdを最低風量とする。ただし設定を維持でき、停止しても再起動幅内に留まる場合は、風量判定より先に空調を停止する。能力最大Q.maxと風量最大Vdsgnは別の量であり、比の分母は常にQ.rtdである。</w:t>
+      </w:r>
+    </w:p>
+    <w:p>
+      <w:pPr>
+        <w:pStyle w:val="31"/>
+        <w:keepNext/>
+        <w:ind w:firstLineChars="100" w:firstLine="230"/>
+        <w:rPr>
+          <w:lang w:eastAsia="ja-JP"/>
+        </w:rPr>
+      </w:pPr>
+      <w:r>
+        <w:t>9.6.3　固定流量方式とファンPQ方式</w:t>
+      </w:r>
+    </w:p>
+    <w:p>
+      <w:pPr>
+        <w:keepNext w:val="0"/>
+        <w:ind w:firstLineChars="100" w:firstLine="230"/>
+        <w:rPr>
+          <w:lang w:eastAsia="ja-JP"/>
+        </w:rPr>
+      </w:pPr>
+      <w:r>
+        <w:t>PQの4点を指定しない既定方式では、吸込側と吹出側の2枝へ同じ正の循環風量を与える。in_nodeとout_nodeが同一でも吹出側を負にしない。初期値はaircon.vol、未指定時は1000/3600 m³/sであり、運転中に負荷追従値へ更新する。</w:t>
+      </w:r>
+    </w:p>
+    <w:p>
+      <w:pPr>
+        <w:keepNext w:val="0"/>
+        <w:ind w:firstLineChars="100" w:firstLine="230"/>
+        <w:rPr>
+          <w:lang w:eastAsia="ja-JP"/>
+        </w:rPr>
+      </w:pPr>
+      <w:r>
+        <w:t>p_max、p1、q1、q_maxをすべて指定すると、builderは吸込側をfan、空調機から吹出までをpressure_lossへ展開し、空調機nodeを圧力未知数にする。4点の一部だけは入力エラーとする。負荷比λ=V/Vdsgnで定格曲線をq′=λq、p′=λ²pに縮小し、実風量はファン曲線とダクト抵抗曲線の交点として圧力回路網から求める。従って目標Vと実風量は一致しない場合がある。</w:t>
+      </w:r>
+    </w:p>
+    <w:p>
+      <w:pPr>
+        <w:keepNext w:val="0"/>
+        <w:ind w:firstLineChars="100" w:firstLine="230"/>
+        <w:rPr>
+          <w:lang w:eastAsia="ja-JP"/>
+        </w:rPr>
+      </w:pPr>
+      <w:r>
+        <w:t>複数室では、ファン枝の総風量を各室へのpressure_lossで配分する。同じ目標風量を各吹出枝へ重ねて与えない。停止中は現在の風量補正を行わないため、直前の固定流量またはファン曲線が残る場合があり、現行実装の適用上の制約である。</w:t>
       </w:r>
     </w:p>
     <w:p>
@@ -37206,11 +37305,8 @@
             <w:vAlign w:val="center"/>
           </w:tcPr>
           <w:p>
-            <w:pPr>
-              <w:spacing w:after="0" w:line="240" w:lineRule="auto"/>
-            </w:pPr>
-            <w:r>
-              <w:t>ON/OFF、Flow、Capacity、SupplyHumidity</w:t>
+            <w:r>
+              <w:t>ON/OFF、Capacity、DuctFlow、SupplyHumidity</w:t>
             </w:r>
           </w:p>
         </w:tc>
@@ -38083,7 +38179,7 @@
         </w:rPr>
       </w:pPr>
       <w:r>
-        <w:t>内側物理連成が収束した後、全空調機の状態更新要求を集約する。再計算要求の優先順位はON/OFF、Flow、Capacity、SupplyHumidityである。それぞれの判定条件に従って再計算を要求し、更新後の空調境界を用いて同一時刻の物理場を再求解する。全台の要求がなく熱の受理条件も満たせば時間ステップを受理する。反復回数や能力制限による再計算割合はsimulation_metricsへ記録する。</w:t>
+        <w:t>内側物理連成が収束した後、全空調機の状態更新要求を集約する。再計算要求の評価順はON/OFF、Capacity、DuctFlow、SupplyHumidityであり、前段で変更があれば後段へ進まず再求解する。全台の要求がなく熱の受理条件も満たせば時間ステップを受理する。反復回数や能力制限による再計算割合はsimulation_metricsへ記録する。</w:t>
       </w:r>
       <w:r/>
     </w:p>
@@ -39163,11 +39259,8 @@
             <w:vAlign w:val="center"/>
           </w:tcPr>
           <w:p>
-            <w:pPr>
-              <w:spacing w:after="0" w:line="240" w:lineRule="auto"/>
-            </w:pPr>
-            <w:r>
-              <w:t>aircon/aircon_controller.cpp</w:t>
+            <w:r>
+              <w:t>aircon_controller.cpp、aircon_onoff.cpp、aircon_airflow.cpp</w:t>
             </w:r>
           </w:p>
         </w:tc>
@@ -39183,11 +39276,8 @@
             <w:vAlign w:val="center"/>
           </w:tcPr>
           <w:p>
-            <w:pPr>
-              <w:spacing w:after="0" w:line="240" w:lineRule="auto"/>
-            </w:pPr>
-            <w:r>
-              <w:t>ON/OFF、処理熱量、吹出湿度、COP 入力</w:t>
+            <w:r>
+              <w:t>ON/OFF、最低能力、処理熱量、負荷追従風量、吹出湿度、COP入力</w:t>
             </w:r>
           </w:p>
         </w:tc>
@@ -42289,48 +42379,9 @@
             <w:vAlign w:val="center"/>
           </w:tcPr>
           <w:p>
-            <w:pPr>
-              <w:spacing w:after="0" w:line="240" w:lineRule="auto"/>
-            </w:pPr>
-            <w:r>
-              <w:t>ON/OFF、</w:t>
-            </w:r>
-            <m:oMath>
-              <m:r>
-                <w:rPr>
-                  <w:rFonts w:ascii="Cambria Math" w:hAnsi="Cambria Math" w:eastAsia="Noto Sans CJK JP"/>
-                  <w:sz w:val="24"/>
-                  <w:szCs w:val="24"/>
-                </w:rPr>
-                <m:t>Q</m:t>
-              </m:r>
-            </m:oMath>
-            <w:r>
-              <w:t>、supplyX、</w:t>
-            </w:r>
-            <m:oMath>
-              <m:r>
-                <w:rPr>
-                  <w:rFonts w:ascii="Cambria Math" w:hAnsi="Cambria Math" w:eastAsia="Noto Sans CJK JP"/>
-                  <w:sz w:val="24"/>
-                  <w:szCs w:val="24"/>
-                </w:rPr>
-                <m:t>COP</m:t>
-              </m:r>
-            </m:oMath>
-            <w:r>
-              <w:t>、</w:t>
-            </w:r>
-            <m:oMath>
-              <m:r>
-                <w:rPr>
-                  <w:rFonts w:ascii="Cambria Math" w:hAnsi="Cambria Math" w:eastAsia="Noto Sans CJK JP"/>
-                  <w:sz w:val="24"/>
-                  <w:szCs w:val="24"/>
-                </w:rPr>
-                <m:t>P</m:t>
-              </m:r>
-            </m:oMath>
+            <w:r>
+              <w:t>ON/OFF → 能力 → DUCT風量 → supplyX → 受理</w:t>
+            </w:r>
           </w:p>
         </w:tc>
       </w:tr>
@@ -42954,6 +43005,15 @@
     </w:p>
     <w:p>
       <w:pPr>
+        <w:spacing w:after="80"/>
+        <w:ind w:left="216" w:firstLine="0"/>
+      </w:pPr>
+      <w:r>
+        <w:t>[R23] engine/docs/aircon_control_principles.md, docs/duct_central_airflow_control.md, docs/documentation_review_2026-09_v175.md — v1.7.5の最低能力、負荷追従風量、固定流量・ファンPQと点検記録。</w:t>
+      </w:r>
+    </w:p>
+    <w:p>
+      <w:pPr>
         <w:pStyle w:val="1"/>
         <w:rPr>
           <w:sz w:val="28"/>
@@ -42992,7 +43052,7 @@
         <w:rPr>
           <w:lang w:eastAsia="ja-JP"/>
         </w:rPr>
-        <w:t>圧力は非線形最小二乗、熱・湿気は疎行列直接解法、濃度は旧時刻の上流濃度を固定した局所解析積分を用いる。各式の解法と近似を区別し、時間ステップ・内側連成・外側空調反復で結合する。v1.7.4の湿度境界と理想除湿を反映した本改訂の点検結果はdocs/documentation_review_2026-09_v174.mdに記録した。</w:t>
+        <w:t>圧力は非線形最小二乗、熱・湿気は疎行列直接解法、濃度は旧時刻の上流濃度を固定した局所解析積分を用いる。各式の解法と近似を区別し、時間ステップ・内側連成・外側空調反復で結合する。v1.7.4の湿度境界と、v1.7.5の全館空調風量・最低能力制御を反映した点検結果は、各差分点検記録に記載した。</w:t>
       </w:r>
     </w:p>
     <w:sectPr>
@@ -43099,39 +43159,16 @@
       <w:rPr>
         <w:color w:val="5A636C"/>
       </w:rPr>
-      <w:t xml:space="preserve">vtsimnx v1.7.4 / 9a5c379　　</w:t>
+      <w:t xml:space="preserve">vtsimnx v1.7.5 / 83a724d　　</w:t>
     </w:r>
-    <w:r>
-      <w:rPr>
-        <w:color w:val="5A636C"/>
-      </w:rPr>
-      <w:fldChar w:fldCharType="begin"/>
-    </w:r>
-    <w:r>
-      <w:rPr>
-        <w:color w:val="5A636C"/>
-      </w:rPr>
-      <w:instrText>PAGE</w:instrText>
-    </w:r>
-    <w:r>
-      <w:rPr>
-        <w:color w:val="5A636C"/>
-      </w:rPr>
-      <w:fldChar w:fldCharType="separate"/>
-    </w:r>
-    <w:r>
-      <w:rPr>
-        <w:noProof/>
-        <w:color w:val="5A636C"/>
-      </w:rPr>
-      <w:t>1</w:t>
-    </w:r>
-    <w:r>
-      <w:rPr>
-        <w:color w:val="5A636C"/>
-      </w:rPr>
-      <w:fldChar w:fldCharType="end"/>
-    </w:r>
+    <w:fldSimple w:instr="PAGE">
+      <w:r>
+        <w:rPr>
+          <w:color w:val="5A636C"/>
+        </w:rPr>
+        <w:t>1</w:t>
+      </w:r>
+    </w:fldSimple>
   </w:p>
 </w:ftr>
 </file>

</xml_diff>